<commit_message>
Resumo executivo de uma pagina para o Comando
RESUMO-COMANDO.md — o SIGEP em cinco pontos (fonte unica, seguranca,
documento com valor juridico, auditoria e backup, sem aprisionamento),
mais o que o sistema ainda nao faz. Cabe numa folha timbrada.

Os geradores passam a aceitar o documento como argumento, entao o mesmo
codigo produz o dossie completo e o resumo. O subtitulo do rodape e das
propriedades sai da primeira linha "## " do proprio arquivo, e documento
de uma pagina so sai sem numeracao. npm run dossie gera os quatro
arquivos de uma vez.

Co-Authored-By: Claude Opus 5 <noreply@anthropic.com>
Claude-Session: https://claude.ai/code/session_01CM14K7wHYEGgUfefseU2e5
</commit_message>
<xml_diff>
--- a/DOSSIE-COMANDO.docx
+++ b/DOSSIE-COMANDO.docx
@@ -7022,8 +7022,19 @@
           <w:sz w:val="21"/>
           <w:szCs w:val="21"/>
         </w:rPr>
-        <w:t xml:space="preserve">Gera </w:t>
-      </w:r>
+        <w:t xml:space="preserve">Gera, com o cabeçalho oficial em todas as páginas:</w:t>
+      </w:r>
+    </w:p>
+    <w:p>
+      <w:pPr>
+        <w:pStyle w:val="ListParagraph"/>
+        <w:numPr>
+          <w:ilvl w:val="0"/>
+          <w:numId w:val="1"/>
+        </w:numPr>
+        <w:spacing w:after="60" w:line="276"/>
+        <w:jc w:val="both"/>
+      </w:pPr>
       <w:r>
         <w:rPr>
           <w:rFonts w:ascii="Consolas" w:cs="Consolas" w:eastAsia="Consolas" w:hAnsi="Consolas"/>
@@ -7052,8 +7063,85 @@
           <w:sz w:val="21"/>
           <w:szCs w:val="21"/>
         </w:rPr>
-        <w:t xml:space="preserve"> com o cabeçalho oficial em todas as páginas.</w:t>
-      </w:r>
+        <w:t xml:space="preserve"> — este documento completo;</w:t>
+      </w:r>
+    </w:p>
+    <w:p>
+      <w:pPr>
+        <w:pStyle w:val="ListParagraph"/>
+        <w:numPr>
+          <w:ilvl w:val="0"/>
+          <w:numId w:val="1"/>
+        </w:numPr>
+        <w:spacing w:after="60" w:line="276"/>
+        <w:jc w:val="both"/>
+      </w:pPr>
+      <w:r>
+        <w:rPr>
+          <w:rFonts w:ascii="Consolas" w:cs="Consolas" w:eastAsia="Consolas" w:hAnsi="Consolas"/>
+          <w:sz w:val="21"/>
+          <w:szCs w:val="21"/>
+        </w:rPr>
+        <w:t xml:space="preserve">RESUMO-COMANDO.docx</w:t>
+      </w:r>
+      <w:r>
+        <w:rPr>
+          <w:sz w:val="21"/>
+          <w:szCs w:val="21"/>
+        </w:rPr>
+        <w:t xml:space="preserve"> e </w:t>
+      </w:r>
+      <w:r>
+        <w:rPr>
+          <w:rFonts w:ascii="Consolas" w:cs="Consolas" w:eastAsia="Consolas" w:hAnsi="Consolas"/>
+          <w:sz w:val="21"/>
+          <w:szCs w:val="21"/>
+        </w:rPr>
+        <w:t xml:space="preserve">RESUMO-COMANDO.pdf</w:t>
+      </w:r>
+      <w:r>
+        <w:rPr>
+          <w:sz w:val="21"/>
+          <w:szCs w:val="21"/>
+        </w:rPr>
+        <w:t xml:space="preserve"> — o resumo executivo de </w:t>
+      </w:r>
+      <w:r>
+        <w:rPr>
+          <w:b/>
+          <w:bCs/>
+          <w:sz w:val="21"/>
+          <w:szCs w:val="21"/>
+        </w:rPr>
+        <w:t xml:space="preserve">uma página</w:t>
+      </w:r>
+      <w:r>
+        <w:rPr>
+          <w:sz w:val="21"/>
+          <w:szCs w:val="21"/>
+        </w:rPr>
+        <w:t xml:space="preserve">, para leitura rápida antes da reunião (o texto dele fica em </w:t>
+      </w:r>
+      <w:r>
+        <w:rPr>
+          <w:rFonts w:ascii="Consolas" w:cs="Consolas" w:eastAsia="Consolas" w:hAnsi="Consolas"/>
+          <w:sz w:val="21"/>
+          <w:szCs w:val="21"/>
+        </w:rPr>
+        <w:t xml:space="preserve">RESUMO-COMANDO.md</w:t>
+      </w:r>
+      <w:r>
+        <w:rPr>
+          <w:sz w:val="21"/>
+          <w:szCs w:val="21"/>
+        </w:rPr>
+        <w:t xml:space="preserve">).</w:t>
+      </w:r>
+    </w:p>
+    <w:p>
+      <w:pPr>
+        <w:spacing w:after="100"/>
+      </w:pPr>
     </w:p>
     <w:sectPr>
       <w:headerReference w:type="default" r:id="rId7"/>

</xml_diff>

<commit_message>
Apresentacao ao Comando: o que resolve, o que ja faz e o que falta
APRESENTACAO-COMANDO.md em tres partes: os problemas que existiam e o que
custavam ao Batalhao; o que o SIGEP ja resolve hoje, por area; e o que
ainda pode ser construido se o Comando autorizar — os nove modulos que ja
aparecem no menu como "em breve", mais 2FA, servidor TURN e a ampliacao da
auditoria.

Os geradores ganharam selos de situacao: uma celula cujo conteudo e so
IMPLANTADO, PARCIAL, A IMPLANTAR ou SE AUTORIZADO sai como etiqueta
colorida, no Word e no PDF, e a coluna reserva a largura do selo. Assim a
tabela e lida de relance, sem precisar ler o texto.

npm run dossie passa a gerar os tres documentos em Word e PDF.

Co-Authored-By: Claude Opus 5 <noreply@anthropic.com>
Claude-Session: https://claude.ai/code/session_01CM14K7wHYEGgUfefseU2e5
</commit_message>
<xml_diff>
--- a/DOSSIE-COMANDO.docx
+++ b/DOSSIE-COMANDO.docx
@@ -7025,123 +7025,498 @@
         <w:t xml:space="preserve">Gera, com o cabeçalho oficial em todas as páginas:</w:t>
       </w:r>
     </w:p>
-    <w:p>
-      <w:pPr>
-        <w:pStyle w:val="ListParagraph"/>
-        <w:numPr>
-          <w:ilvl w:val="0"/>
-          <w:numId w:val="1"/>
-        </w:numPr>
-        <w:spacing w:after="60" w:line="276"/>
+    <w:tbl>
+      <w:tblPr>
+        <w:tblW w:type="pct" w:w="100%"/>
+        <w:tblBorders>
+          <w:top w:val="single" w:color="auto" w:sz="4"/>
+          <w:left w:val="single" w:color="auto" w:sz="4"/>
+          <w:bottom w:val="single" w:color="auto" w:sz="4"/>
+          <w:right w:val="single" w:color="auto" w:sz="4"/>
+          <w:insideH w:val="single" w:color="auto" w:sz="4"/>
+          <w:insideV w:val="single" w:color="auto" w:sz="4"/>
+        </w:tblBorders>
+      </w:tblPr>
+      <w:tblGrid>
+        <w:gridCol w:w="100"/>
+        <w:gridCol w:w="100"/>
+        <w:gridCol w:w="100"/>
+      </w:tblGrid>
+      <w:tr>
+        <w:trPr>
+          <w:tblHeader/>
+        </w:trPr>
+        <w:tc>
+          <w:tcPr>
+            <w:tcW w:type="pct" w:w="33%"/>
+            <w:tcBorders>
+              <w:top w:val="single" w:color="AAAAAA" w:sz="4"/>
+              <w:left w:val="single" w:color="AAAAAA" w:sz="4"/>
+              <w:bottom w:val="single" w:color="AAAAAA" w:sz="4"/>
+              <w:right w:val="single" w:color="AAAAAA" w:sz="4"/>
+            </w:tcBorders>
+            <w:shd w:fill="0B1F3A"/>
+            <w:tcMar>
+              <w:top w:type="dxa" w:w="60"/>
+              <w:left w:type="dxa" w:w="90"/>
+              <w:bottom w:type="dxa" w:w="60"/>
+              <w:right w:type="dxa" w:w="90"/>
+            </w:tcMar>
+            <w:vAlign w:val="center"/>
+          </w:tcPr>
+          <w:p>
+            <w:pPr>
+              <w:jc w:val="left"/>
+            </w:pPr>
+            <w:r>
+              <w:rPr>
+                <w:b/>
+                <w:bCs/>
+                <w:color w:val="FFFFFF"/>
+                <w:sz w:val="18"/>
+                <w:szCs w:val="18"/>
+              </w:rPr>
+              <w:t xml:space="preserve">Arquivo</w:t>
+            </w:r>
+          </w:p>
+        </w:tc>
+        <w:tc>
+          <w:tcPr>
+            <w:tcW w:type="pct" w:w="33%"/>
+            <w:tcBorders>
+              <w:top w:val="single" w:color="AAAAAA" w:sz="4"/>
+              <w:left w:val="single" w:color="AAAAAA" w:sz="4"/>
+              <w:bottom w:val="single" w:color="AAAAAA" w:sz="4"/>
+              <w:right w:val="single" w:color="AAAAAA" w:sz="4"/>
+            </w:tcBorders>
+            <w:shd w:fill="0B1F3A"/>
+            <w:tcMar>
+              <w:top w:type="dxa" w:w="60"/>
+              <w:left w:type="dxa" w:w="90"/>
+              <w:bottom w:type="dxa" w:w="60"/>
+              <w:right w:type="dxa" w:w="90"/>
+            </w:tcMar>
+            <w:vAlign w:val="center"/>
+          </w:tcPr>
+          <w:p>
+            <w:pPr>
+              <w:jc w:val="left"/>
+            </w:pPr>
+            <w:r>
+              <w:rPr>
+                <w:b/>
+                <w:bCs/>
+                <w:color w:val="FFFFFF"/>
+                <w:sz w:val="18"/>
+                <w:szCs w:val="18"/>
+              </w:rPr>
+              <w:t xml:space="preserve">O que é</w:t>
+            </w:r>
+          </w:p>
+        </w:tc>
+        <w:tc>
+          <w:tcPr>
+            <w:tcW w:type="pct" w:w="33%"/>
+            <w:tcBorders>
+              <w:top w:val="single" w:color="AAAAAA" w:sz="4"/>
+              <w:left w:val="single" w:color="AAAAAA" w:sz="4"/>
+              <w:bottom w:val="single" w:color="AAAAAA" w:sz="4"/>
+              <w:right w:val="single" w:color="AAAAAA" w:sz="4"/>
+            </w:tcBorders>
+            <w:shd w:fill="0B1F3A"/>
+            <w:tcMar>
+              <w:top w:type="dxa" w:w="60"/>
+              <w:left w:type="dxa" w:w="90"/>
+              <w:bottom w:type="dxa" w:w="60"/>
+              <w:right w:type="dxa" w:w="90"/>
+            </w:tcMar>
+            <w:vAlign w:val="center"/>
+          </w:tcPr>
+          <w:p>
+            <w:pPr>
+              <w:jc w:val="left"/>
+            </w:pPr>
+            <w:r>
+              <w:rPr>
+                <w:b/>
+                <w:bCs/>
+                <w:color w:val="FFFFFF"/>
+                <w:sz w:val="18"/>
+                <w:szCs w:val="18"/>
+              </w:rPr>
+              <w:t xml:space="preserve">Fonte</w:t>
+            </w:r>
+          </w:p>
+        </w:tc>
+      </w:tr>
+      <w:tr>
+        <w:tc>
+          <w:tcPr>
+            <w:tcW w:type="pct" w:w="33%"/>
+            <w:tcBorders>
+              <w:top w:val="single" w:color="AAAAAA" w:sz="4"/>
+              <w:left w:val="single" w:color="AAAAAA" w:sz="4"/>
+              <w:bottom w:val="single" w:color="AAAAAA" w:sz="4"/>
+              <w:right w:val="single" w:color="AAAAAA" w:sz="4"/>
+            </w:tcBorders>
+            <w:tcMar>
+              <w:top w:type="dxa" w:w="60"/>
+              <w:left w:type="dxa" w:w="90"/>
+              <w:bottom w:type="dxa" w:w="60"/>
+              <w:right w:type="dxa" w:w="90"/>
+            </w:tcMar>
+            <w:vAlign w:val="center"/>
+          </w:tcPr>
+          <w:p>
+            <w:pPr>
+              <w:jc w:val="left"/>
+            </w:pPr>
+            <w:r>
+              <w:rPr>
+                <w:rFonts w:ascii="Consolas" w:cs="Consolas" w:eastAsia="Consolas" w:hAnsi="Consolas"/>
+                <w:sz w:val="18"/>
+                <w:szCs w:val="18"/>
+              </w:rPr>
+              <w:t xml:space="preserve">DOSSIE-COMANDO</w:t>
+            </w:r>
+          </w:p>
+        </w:tc>
+        <w:tc>
+          <w:tcPr>
+            <w:tcW w:type="pct" w:w="33%"/>
+            <w:tcBorders>
+              <w:top w:val="single" w:color="AAAAAA" w:sz="4"/>
+              <w:left w:val="single" w:color="AAAAAA" w:sz="4"/>
+              <w:bottom w:val="single" w:color="AAAAAA" w:sz="4"/>
+              <w:right w:val="single" w:color="AAAAAA" w:sz="4"/>
+            </w:tcBorders>
+            <w:tcMar>
+              <w:top w:type="dxa" w:w="60"/>
+              <w:left w:type="dxa" w:w="90"/>
+              <w:bottom w:type="dxa" w:w="60"/>
+              <w:right w:type="dxa" w:w="90"/>
+            </w:tcMar>
+            <w:vAlign w:val="center"/>
+          </w:tcPr>
+          <w:p>
+            <w:pPr>
+              <w:jc w:val="left"/>
+            </w:pPr>
+            <w:r>
+              <w:rPr>
+                <w:sz w:val="18"/>
+                <w:szCs w:val="18"/>
+              </w:rPr>
+              <w:t xml:space="preserve">Este documento — o técnico completo</w:t>
+            </w:r>
+          </w:p>
+        </w:tc>
+        <w:tc>
+          <w:tcPr>
+            <w:tcW w:type="pct" w:w="33%"/>
+            <w:tcBorders>
+              <w:top w:val="single" w:color="AAAAAA" w:sz="4"/>
+              <w:left w:val="single" w:color="AAAAAA" w:sz="4"/>
+              <w:bottom w:val="single" w:color="AAAAAA" w:sz="4"/>
+              <w:right w:val="single" w:color="AAAAAA" w:sz="4"/>
+            </w:tcBorders>
+            <w:tcMar>
+              <w:top w:type="dxa" w:w="60"/>
+              <w:left w:type="dxa" w:w="90"/>
+              <w:bottom w:type="dxa" w:w="60"/>
+              <w:right w:type="dxa" w:w="90"/>
+            </w:tcMar>
+            <w:vAlign w:val="center"/>
+          </w:tcPr>
+          <w:p>
+            <w:pPr>
+              <w:jc w:val="left"/>
+            </w:pPr>
+            <w:r>
+              <w:rPr>
+                <w:rFonts w:ascii="Consolas" w:cs="Consolas" w:eastAsia="Consolas" w:hAnsi="Consolas"/>
+                <w:sz w:val="18"/>
+                <w:szCs w:val="18"/>
+              </w:rPr>
+              <w:t xml:space="preserve">DOSSIE-COMANDO.md</w:t>
+            </w:r>
+          </w:p>
+        </w:tc>
+      </w:tr>
+      <w:tr>
+        <w:tc>
+          <w:tcPr>
+            <w:tcW w:type="pct" w:w="33%"/>
+            <w:tcBorders>
+              <w:top w:val="single" w:color="AAAAAA" w:sz="4"/>
+              <w:left w:val="single" w:color="AAAAAA" w:sz="4"/>
+              <w:bottom w:val="single" w:color="AAAAAA" w:sz="4"/>
+              <w:right w:val="single" w:color="AAAAAA" w:sz="4"/>
+            </w:tcBorders>
+            <w:shd w:fill="F4F6F9"/>
+            <w:tcMar>
+              <w:top w:type="dxa" w:w="60"/>
+              <w:left w:type="dxa" w:w="90"/>
+              <w:bottom w:type="dxa" w:w="60"/>
+              <w:right w:type="dxa" w:w="90"/>
+            </w:tcMar>
+            <w:vAlign w:val="center"/>
+          </w:tcPr>
+          <w:p>
+            <w:pPr>
+              <w:jc w:val="left"/>
+            </w:pPr>
+            <w:r>
+              <w:rPr>
+                <w:rFonts w:ascii="Consolas" w:cs="Consolas" w:eastAsia="Consolas" w:hAnsi="Consolas"/>
+                <w:sz w:val="18"/>
+                <w:szCs w:val="18"/>
+              </w:rPr>
+              <w:t xml:space="preserve">RESUMO-COMANDO</w:t>
+            </w:r>
+          </w:p>
+        </w:tc>
+        <w:tc>
+          <w:tcPr>
+            <w:tcW w:type="pct" w:w="33%"/>
+            <w:tcBorders>
+              <w:top w:val="single" w:color="AAAAAA" w:sz="4"/>
+              <w:left w:val="single" w:color="AAAAAA" w:sz="4"/>
+              <w:bottom w:val="single" w:color="AAAAAA" w:sz="4"/>
+              <w:right w:val="single" w:color="AAAAAA" w:sz="4"/>
+            </w:tcBorders>
+            <w:shd w:fill="F4F6F9"/>
+            <w:tcMar>
+              <w:top w:type="dxa" w:w="60"/>
+              <w:left w:type="dxa" w:w="90"/>
+              <w:bottom w:type="dxa" w:w="60"/>
+              <w:right w:type="dxa" w:w="90"/>
+            </w:tcMar>
+            <w:vAlign w:val="center"/>
+          </w:tcPr>
+          <w:p>
+            <w:pPr>
+              <w:jc w:val="left"/>
+            </w:pPr>
+            <w:r>
+              <w:rPr>
+                <w:sz w:val="18"/>
+                <w:szCs w:val="18"/>
+              </w:rPr>
+              <w:t xml:space="preserve">Resumo executivo de </w:t>
+            </w:r>
+            <w:r>
+              <w:rPr>
+                <w:b/>
+                <w:bCs/>
+                <w:sz w:val="18"/>
+                <w:szCs w:val="18"/>
+              </w:rPr>
+              <w:t xml:space="preserve">uma página</w:t>
+            </w:r>
+          </w:p>
+        </w:tc>
+        <w:tc>
+          <w:tcPr>
+            <w:tcW w:type="pct" w:w="33%"/>
+            <w:tcBorders>
+              <w:top w:val="single" w:color="AAAAAA" w:sz="4"/>
+              <w:left w:val="single" w:color="AAAAAA" w:sz="4"/>
+              <w:bottom w:val="single" w:color="AAAAAA" w:sz="4"/>
+              <w:right w:val="single" w:color="AAAAAA" w:sz="4"/>
+            </w:tcBorders>
+            <w:shd w:fill="F4F6F9"/>
+            <w:tcMar>
+              <w:top w:type="dxa" w:w="60"/>
+              <w:left w:type="dxa" w:w="90"/>
+              <w:bottom w:type="dxa" w:w="60"/>
+              <w:right w:type="dxa" w:w="90"/>
+            </w:tcMar>
+            <w:vAlign w:val="center"/>
+          </w:tcPr>
+          <w:p>
+            <w:pPr>
+              <w:jc w:val="left"/>
+            </w:pPr>
+            <w:r>
+              <w:rPr>
+                <w:rFonts w:ascii="Consolas" w:cs="Consolas" w:eastAsia="Consolas" w:hAnsi="Consolas"/>
+                <w:sz w:val="18"/>
+                <w:szCs w:val="18"/>
+              </w:rPr>
+              <w:t xml:space="preserve">RESUMO-COMANDO.md</w:t>
+            </w:r>
+          </w:p>
+        </w:tc>
+      </w:tr>
+      <w:tr>
+        <w:tc>
+          <w:tcPr>
+            <w:tcW w:type="pct" w:w="33%"/>
+            <w:tcBorders>
+              <w:top w:val="single" w:color="AAAAAA" w:sz="4"/>
+              <w:left w:val="single" w:color="AAAAAA" w:sz="4"/>
+              <w:bottom w:val="single" w:color="AAAAAA" w:sz="4"/>
+              <w:right w:val="single" w:color="AAAAAA" w:sz="4"/>
+            </w:tcBorders>
+            <w:tcMar>
+              <w:top w:type="dxa" w:w="60"/>
+              <w:left w:type="dxa" w:w="90"/>
+              <w:bottom w:type="dxa" w:w="60"/>
+              <w:right w:type="dxa" w:w="90"/>
+            </w:tcMar>
+            <w:vAlign w:val="center"/>
+          </w:tcPr>
+          <w:p>
+            <w:pPr>
+              <w:jc w:val="left"/>
+            </w:pPr>
+            <w:r>
+              <w:rPr>
+                <w:rFonts w:ascii="Consolas" w:cs="Consolas" w:eastAsia="Consolas" w:hAnsi="Consolas"/>
+                <w:sz w:val="18"/>
+                <w:szCs w:val="18"/>
+              </w:rPr>
+              <w:t xml:space="preserve">APRESENTACAO-COMANDO</w:t>
+            </w:r>
+          </w:p>
+        </w:tc>
+        <w:tc>
+          <w:tcPr>
+            <w:tcW w:type="pct" w:w="33%"/>
+            <w:tcBorders>
+              <w:top w:val="single" w:color="AAAAAA" w:sz="4"/>
+              <w:left w:val="single" w:color="AAAAAA" w:sz="4"/>
+              <w:bottom w:val="single" w:color="AAAAAA" w:sz="4"/>
+              <w:right w:val="single" w:color="AAAAAA" w:sz="4"/>
+            </w:tcBorders>
+            <w:tcMar>
+              <w:top w:type="dxa" w:w="60"/>
+              <w:left w:type="dxa" w:w="90"/>
+              <w:bottom w:type="dxa" w:w="60"/>
+              <w:right w:type="dxa" w:w="90"/>
+            </w:tcMar>
+            <w:vAlign w:val="center"/>
+          </w:tcPr>
+          <w:p>
+            <w:pPr>
+              <w:jc w:val="left"/>
+            </w:pPr>
+            <w:r>
+              <w:rPr>
+                <w:sz w:val="18"/>
+                <w:szCs w:val="18"/>
+              </w:rPr>
+              <w:t xml:space="preserve">O que resolve, o que já está pronto e o que falta</w:t>
+            </w:r>
+          </w:p>
+        </w:tc>
+        <w:tc>
+          <w:tcPr>
+            <w:tcW w:type="pct" w:w="33%"/>
+            <w:tcBorders>
+              <w:top w:val="single" w:color="AAAAAA" w:sz="4"/>
+              <w:left w:val="single" w:color="AAAAAA" w:sz="4"/>
+              <w:bottom w:val="single" w:color="AAAAAA" w:sz="4"/>
+              <w:right w:val="single" w:color="AAAAAA" w:sz="4"/>
+            </w:tcBorders>
+            <w:tcMar>
+              <w:top w:type="dxa" w:w="60"/>
+              <w:left w:type="dxa" w:w="90"/>
+              <w:bottom w:type="dxa" w:w="60"/>
+              <w:right w:type="dxa" w:w="90"/>
+            </w:tcMar>
+            <w:vAlign w:val="center"/>
+          </w:tcPr>
+          <w:p>
+            <w:pPr>
+              <w:jc w:val="left"/>
+            </w:pPr>
+            <w:r>
+              <w:rPr>
+                <w:rFonts w:ascii="Consolas" w:cs="Consolas" w:eastAsia="Consolas" w:hAnsi="Consolas"/>
+                <w:sz w:val="18"/>
+                <w:szCs w:val="18"/>
+              </w:rPr>
+              <w:t xml:space="preserve">APRESENTACAO-COMANDO.md</w:t>
+            </w:r>
+          </w:p>
+        </w:tc>
+      </w:tr>
+    </w:tbl>
+    <w:p>
+      <w:pPr>
+        <w:spacing w:after="200"/>
+      </w:pPr>
+    </w:p>
+    <w:p>
+      <w:pPr>
+        <w:spacing w:after="120" w:line="276"/>
         <w:jc w:val="both"/>
       </w:pPr>
       <w:r>
         <w:rPr>
-          <w:rFonts w:ascii="Consolas" w:cs="Consolas" w:eastAsia="Consolas" w:hAnsi="Consolas"/>
-          <w:sz w:val="21"/>
-          <w:szCs w:val="21"/>
-        </w:rPr>
-        <w:t xml:space="preserve">DOSSIE-COMANDO.docx</w:t>
-      </w:r>
-      <w:r>
-        <w:rPr>
-          <w:sz w:val="21"/>
-          <w:szCs w:val="21"/>
-        </w:rPr>
-        <w:t xml:space="preserve"> e </w:t>
-      </w:r>
-      <w:r>
-        <w:rPr>
-          <w:rFonts w:ascii="Consolas" w:cs="Consolas" w:eastAsia="Consolas" w:hAnsi="Consolas"/>
-          <w:sz w:val="21"/>
-          <w:szCs w:val="21"/>
-        </w:rPr>
-        <w:t xml:space="preserve">DOSSIE-COMANDO.pdf</w:t>
-      </w:r>
-      <w:r>
-        <w:rPr>
-          <w:sz w:val="21"/>
-          <w:szCs w:val="21"/>
-        </w:rPr>
-        <w:t xml:space="preserve"> — este documento completo;</w:t>
-      </w:r>
-    </w:p>
-    <w:p>
-      <w:pPr>
-        <w:pStyle w:val="ListParagraph"/>
-        <w:numPr>
-          <w:ilvl w:val="0"/>
-          <w:numId w:val="1"/>
-        </w:numPr>
-        <w:spacing w:after="60" w:line="276"/>
-        <w:jc w:val="both"/>
-      </w:pPr>
-      <w:r>
-        <w:rPr>
-          <w:rFonts w:ascii="Consolas" w:cs="Consolas" w:eastAsia="Consolas" w:hAnsi="Consolas"/>
-          <w:sz w:val="21"/>
-          <w:szCs w:val="21"/>
-        </w:rPr>
-        <w:t xml:space="preserve">RESUMO-COMANDO.docx</w:t>
-      </w:r>
-      <w:r>
-        <w:rPr>
-          <w:sz w:val="21"/>
-          <w:szCs w:val="21"/>
-        </w:rPr>
-        <w:t xml:space="preserve"> e </w:t>
-      </w:r>
-      <w:r>
-        <w:rPr>
-          <w:rFonts w:ascii="Consolas" w:cs="Consolas" w:eastAsia="Consolas" w:hAnsi="Consolas"/>
-          <w:sz w:val="21"/>
-          <w:szCs w:val="21"/>
-        </w:rPr>
-        <w:t xml:space="preserve">RESUMO-COMANDO.pdf</w:t>
-      </w:r>
-      <w:r>
-        <w:rPr>
-          <w:sz w:val="21"/>
-          <w:szCs w:val="21"/>
-        </w:rPr>
-        <w:t xml:space="preserve"> — o resumo executivo de </w:t>
-      </w:r>
-      <w:r>
-        <w:rPr>
-          <w:b/>
-          <w:bCs/>
-          <w:sz w:val="21"/>
-          <w:szCs w:val="21"/>
-        </w:rPr>
-        <w:t xml:space="preserve">uma página</w:t>
-      </w:r>
-      <w:r>
-        <w:rPr>
-          <w:sz w:val="21"/>
-          <w:szCs w:val="21"/>
-        </w:rPr>
-        <w:t xml:space="preserve">, para leitura rápida antes da reunião (o texto dele fica em </w:t>
-      </w:r>
-      <w:r>
-        <w:rPr>
-          <w:rFonts w:ascii="Consolas" w:cs="Consolas" w:eastAsia="Consolas" w:hAnsi="Consolas"/>
-          <w:sz w:val="21"/>
-          <w:szCs w:val="21"/>
-        </w:rPr>
-        <w:t xml:space="preserve">RESUMO-COMANDO.md</w:t>
-      </w:r>
-      <w:r>
-        <w:rPr>
-          <w:sz w:val="21"/>
-          <w:szCs w:val="21"/>
-        </w:rPr>
-        <w:t xml:space="preserve">).</w:t>
-      </w:r>
-    </w:p>
-    <w:p>
-      <w:pPr>
-        <w:spacing w:after="100"/>
-      </w:pPr>
+          <w:sz w:val="21"/>
+          <w:szCs w:val="21"/>
+        </w:rPr>
+        <w:t xml:space="preserve">Nas tabelas, uma célula cujo conteúdo seja só </w:t>
+      </w:r>
+      <w:r>
+        <w:rPr>
+          <w:sz w:val="21"/>
+          <w:szCs w:val="21"/>
+        </w:rPr>
+        <w:t xml:space="preserve">IMPLANTADO</w:t>
+      </w:r>
+      <w:r>
+        <w:rPr>
+          <w:sz w:val="21"/>
+          <w:szCs w:val="21"/>
+        </w:rPr>
+        <w:t xml:space="preserve">, </w:t>
+      </w:r>
+      <w:r>
+        <w:rPr>
+          <w:sz w:val="21"/>
+          <w:szCs w:val="21"/>
+        </w:rPr>
+        <w:t xml:space="preserve">PARCIAL</w:t>
+      </w:r>
+      <w:r>
+        <w:rPr>
+          <w:sz w:val="21"/>
+          <w:szCs w:val="21"/>
+        </w:rPr>
+        <w:t xml:space="preserve">, </w:t>
+      </w:r>
+      <w:r>
+        <w:rPr>
+          <w:sz w:val="21"/>
+          <w:szCs w:val="21"/>
+        </w:rPr>
+        <w:t xml:space="preserve">A IMPLANTAR</w:t>
+      </w:r>
+      <w:r>
+        <w:rPr>
+          <w:sz w:val="21"/>
+          <w:szCs w:val="21"/>
+        </w:rPr>
+        <w:t xml:space="preserve"> ou </w:t>
+      </w:r>
+      <w:r>
+        <w:rPr>
+          <w:sz w:val="21"/>
+          <w:szCs w:val="21"/>
+        </w:rPr>
+        <w:t xml:space="preserve">SE AUTORIZADO</w:t>
+      </w:r>
+      <w:r>
+        <w:rPr>
+          <w:sz w:val="21"/>
+          <w:szCs w:val="21"/>
+        </w:rPr>
+        <w:t xml:space="preserve"> sai como etiqueta colorida.</w:t>
+      </w:r>
     </w:p>
     <w:sectPr>
       <w:headerReference w:type="default" r:id="rId7"/>

</xml_diff>